<commit_message>
Commented out data opening code (not necessary at the moment)
</commit_message>
<xml_diff>
--- a/Report/00_guther_main.docx
+++ b/Report/00_guther_main.docx
@@ -572,7 +572,7 @@
               <w:pStyle w:val="Compact"/>
             </w:pPr>
             <w:r>
-              <w:t xml:space="preserve">Number of Participants</w:t>
+              <w:t xml:space="preserve">Number of Transactions</w:t>
             </w:r>
           </w:p>
         </w:tc>
@@ -606,6 +606,9 @@
             <w:pPr>
               <w:pStyle w:val="Compact"/>
             </w:pPr>
+            <w:r>
+              <w:t xml:space="preserve">44</w:t>
+            </w:r>
           </w:p>
         </w:tc>
         <w:tc>
@@ -615,7 +618,7 @@
               <w:pStyle w:val="Compact"/>
             </w:pPr>
             <w:r>
-              <w:t xml:space="preserve">Psychology</w:t>
+              <w:t xml:space="preserve">Psychology (RPP)</w:t>
             </w:r>
           </w:p>
         </w:tc>
@@ -625,6 +628,9 @@
             <w:pPr>
               <w:pStyle w:val="Compact"/>
             </w:pPr>
+            <w:r>
+              <w:t xml:space="preserve">2,496</w:t>
+            </w:r>
           </w:p>
         </w:tc>
         <w:tc>
@@ -633,6 +639,9 @@
             <w:pPr>
               <w:pStyle w:val="Compact"/>
             </w:pPr>
+            <w:r>
+              <w:t xml:space="preserve">39% actual success rate versus 55% predicted success rate</w:t>
+            </w:r>
           </w:p>
         </w:tc>
       </w:tr>
@@ -654,6 +663,9 @@
             <w:pPr>
               <w:pStyle w:val="Compact"/>
             </w:pPr>
+            <w:r>
+              <w:t xml:space="preserve">18</w:t>
+            </w:r>
           </w:p>
         </w:tc>
         <w:tc>
@@ -663,7 +675,7 @@
               <w:pStyle w:val="Compact"/>
             </w:pPr>
             <w:r>
-              <w:t xml:space="preserve">Economics</w:t>
+              <w:t xml:space="preserve">Economics (EERP)</w:t>
             </w:r>
           </w:p>
         </w:tc>
@@ -673,6 +685,9 @@
             <w:pPr>
               <w:pStyle w:val="Compact"/>
             </w:pPr>
+            <w:r>
+              <w:t xml:space="preserve">NA</w:t>
+            </w:r>
           </w:p>
         </w:tc>
         <w:tc>
@@ -681,6 +696,9 @@
             <w:pPr>
               <w:pStyle w:val="Compact"/>
             </w:pPr>
+            <w:r>
+              <w:t xml:space="preserve">61.1% actual success rate versus 75.2% predicted success</w:t>
+            </w:r>
           </w:p>
         </w:tc>
       </w:tr>
@@ -702,6 +720,9 @@
             <w:pPr>
               <w:pStyle w:val="Compact"/>
             </w:pPr>
+            <w:r>
+              <w:t xml:space="preserve">21</w:t>
+            </w:r>
           </w:p>
         </w:tc>
         <w:tc>
@@ -721,6 +742,9 @@
             <w:pPr>
               <w:pStyle w:val="Compact"/>
             </w:pPr>
+            <w:r>
+              <w:t xml:space="preserve">NA</w:t>
+            </w:r>
           </w:p>
         </w:tc>
         <w:tc>
@@ -729,6 +753,9 @@
             <w:pPr>
               <w:pStyle w:val="Compact"/>
             </w:pPr>
+            <w:r>
+              <w:t xml:space="preserve">62% actual success rate versus 63.4% predicted success</w:t>
+            </w:r>
           </w:p>
         </w:tc>
       </w:tr>
@@ -807,6 +834,9 @@
             <w:pPr>
               <w:pStyle w:val="Compact"/>
             </w:pPr>
+            <w:r>
+              <w:t xml:space="preserve">28</w:t>
+            </w:r>
           </w:p>
         </w:tc>
         <w:tc>
@@ -826,6 +856,9 @@
             <w:pPr>
               <w:pStyle w:val="Compact"/>
             </w:pPr>
+            <w:r>
+              <w:t xml:space="preserve">NA</w:t>
+            </w:r>
           </w:p>
         </w:tc>
         <w:tc>
@@ -834,6 +867,9 @@
             <w:pPr>
               <w:pStyle w:val="Compact"/>
             </w:pPr>
+            <w:r>
+              <w:t xml:space="preserve">75% correct predictions</w:t>
+            </w:r>
           </w:p>
         </w:tc>
       </w:tr>
@@ -855,6 +891,9 @@
             <w:pPr>
               <w:pStyle w:val="Compact"/>
             </w:pPr>
+            <w:r>
+              <w:t xml:space="preserve">144</w:t>
+            </w:r>
           </w:p>
         </w:tc>
         <w:tc>
@@ -863,6 +902,9 @@
             <w:pPr>
               <w:pStyle w:val="Compact"/>
             </w:pPr>
+            <w:r>
+              <w:t xml:space="preserve">Combination of RPP, EERP, ML1</w:t>
+            </w:r>
           </w:p>
         </w:tc>
         <w:tc>
@@ -883,53 +925,8 @@
               <w:pStyle w:val="Compact"/>
             </w:pPr>
             <w:r>
-              <w:t xml:space="preserve">71% AUC</w:t>
+              <w:t xml:space="preserve">70% accuracy (AUC =0.77)</w:t>
             </w:r>
-          </w:p>
-        </w:tc>
-      </w:tr>
-      <w:tr>
-        <w:tc>
-          <w:tcPr/>
-          <w:p>
-            <w:pPr>
-              <w:pStyle w:val="Compact"/>
-            </w:pPr>
-            <w:r>
-              <w:t xml:space="preserve">Center for Open Science and Framework for Open and Reproducible Research Training (2024)</w:t>
-            </w:r>
-          </w:p>
-        </w:tc>
-        <w:tc>
-          <w:tcPr/>
-          <w:p>
-            <w:pPr>
-              <w:pStyle w:val="Compact"/>
-            </w:pPr>
-          </w:p>
-        </w:tc>
-        <w:tc>
-          <w:tcPr/>
-          <w:p>
-            <w:pPr>
-              <w:pStyle w:val="Compact"/>
-            </w:pPr>
-          </w:p>
-        </w:tc>
-        <w:tc>
-          <w:tcPr/>
-          <w:p>
-            <w:pPr>
-              <w:pStyle w:val="Compact"/>
-            </w:pPr>
-          </w:p>
-        </w:tc>
-        <w:tc>
-          <w:tcPr/>
-          <w:p>
-            <w:pPr>
-              <w:pStyle w:val="Compact"/>
-            </w:pPr>
           </w:p>
         </w:tc>
       </w:tr>
@@ -1390,7 +1387,7 @@
         <w:t xml:space="preserve"> </w:t>
       </w:r>
       <w:r>
-        <w:t xml:space="preserve">(Version 2.4.6; Wickham, Hester, &amp; Chang, 2020)</w:t>
+        <w:t xml:space="preserve">(Version 2.5.0; Wickham, Hester, &amp; Chang, 2020)</w:t>
       </w:r>
       <w:r>
         <w:t xml:space="preserve">,</w:t>
@@ -1504,7 +1501,7 @@
         <w:t xml:space="preserve"> </w:t>
       </w:r>
       <w:r>
-        <w:t xml:space="preserve">(Version 4.0.2; Wickham, 2016)</w:t>
+        <w:t xml:space="preserve">(Version 4.0.3; Wickham, 2016)</w:t>
       </w:r>
       <w:r>
         <w:t xml:space="preserve">,</w:t>
@@ -1713,7 +1710,7 @@
         <w:t xml:space="preserve"> </w:t>
       </w:r>
       <w:r>
-        <w:t xml:space="preserve">(Version 2.1.5; Wickham, Hester, &amp; Bryan, 2023)</w:t>
+        <w:t xml:space="preserve">(Version 2.2.0; Wickham, Hester, &amp; Bryan, 2023)</w:t>
       </w:r>
       <w:r>
         <w:t xml:space="preserve">,</w:t>
@@ -2381,7 +2378,7 @@
     </w:p>
     <w:bookmarkEnd w:id="41"/>
     <w:bookmarkEnd w:id="42"/>
-    <w:bookmarkStart w:id="154" w:name="references"/>
+    <w:bookmarkStart w:id="152" w:name="references"/>
     <w:p>
       <w:pPr>
         <w:pStyle w:val="berschrift1"/>
@@ -2390,7 +2387,7 @@
         <w:t xml:space="preserve">References</w:t>
       </w:r>
     </w:p>
-    <w:bookmarkStart w:id="153" w:name="refs"/>
+    <w:bookmarkStart w:id="151" w:name="refs"/>
     <w:bookmarkStart w:id="44" w:name="ref-R-rticles"/>
     <w:p>
       <w:pPr>
@@ -2946,120 +2943,44 @@
       </w:r>
     </w:p>
     <w:bookmarkEnd w:id="65"/>
-    <w:bookmarkStart w:id="67" w:name="ref-cos_forrt_2024"/>
+    <w:bookmarkStart w:id="67" w:name="ref-Dreber2015"/>
     <w:p>
       <w:pPr>
         <w:pStyle w:val="Literaturverzeichnis"/>
       </w:pPr>
       <w:r>
-        <w:t xml:space="preserve">Center for Open Science, &amp; Framework for Open and Reproducible Research Training. (2024).</w:t>
-      </w:r>
-      <w:r>
-        <w:t xml:space="preserve"> </w:t>
-      </w:r>
-      <w:r>
-        <w:rPr>
-          <w:i/>
-          <w:iCs/>
-        </w:rPr>
-        <w:t xml:space="preserve">COS</w:t>
-      </w:r>
-      <w:r>
-        <w:rPr>
-          <w:i/>
-          <w:iCs/>
-        </w:rPr>
-        <w:t xml:space="preserve"> </w:t>
-      </w:r>
-      <w:r>
-        <w:rPr>
-          <w:i/>
-          <w:iCs/>
-        </w:rPr>
-        <w:t xml:space="preserve">and</w:t>
-      </w:r>
-      <w:r>
-        <w:rPr>
-          <w:i/>
-          <w:iCs/>
-        </w:rPr>
-        <w:t xml:space="preserve"> </w:t>
-      </w:r>
-      <w:r>
-        <w:rPr>
-          <w:i/>
-          <w:iCs/>
-        </w:rPr>
-        <w:t xml:space="preserve">FORRT</w:t>
-      </w:r>
-      <w:r>
-        <w:rPr>
-          <w:i/>
-          <w:iCs/>
-        </w:rPr>
-        <w:t xml:space="preserve"> </w:t>
-      </w:r>
-      <w:r>
-        <w:rPr>
-          <w:i/>
-          <w:iCs/>
-        </w:rPr>
-        <w:t xml:space="preserve">partner to increase discoverability and usability of replication evidence</w:t>
-      </w:r>
-      <w:r>
-        <w:t xml:space="preserve">. Blog post. Retrieved from</w:t>
+        <w:t xml:space="preserve">Dreber, A., Pfeiffer, T., Almenberg, J., Isaksson, S., Wilson, B., Chen, Y., … Johannesson, M. (2015). Using prediction markets to estimate the reproducibility of scientific research.</w:t>
+      </w:r>
+      <w:r>
+        <w:t xml:space="preserve"> </w:t>
+      </w:r>
+      <w:r>
+        <w:rPr>
+          <w:i/>
+          <w:iCs/>
+        </w:rPr>
+        <w:t xml:space="preserve">Proceedings of the National Academy of Sciences</w:t>
+      </w:r>
+      <w:r>
+        <w:t xml:space="preserve">,</w:t>
+      </w:r>
+      <w:r>
+        <w:t xml:space="preserve"> </w:t>
+      </w:r>
+      <w:r>
+        <w:rPr>
+          <w:i/>
+          <w:iCs/>
+        </w:rPr>
+        <w:t xml:space="preserve">112</w:t>
+      </w:r>
+      <w:r>
+        <w:t xml:space="preserve">(50), 15343–15347.</w:t>
       </w:r>
       <w:r>
         <w:t xml:space="preserve"> </w:t>
       </w:r>
       <w:hyperlink r:id="rId66">
-        <w:r>
-          <w:rPr>
-            <w:rStyle w:val="Hyperlink"/>
-          </w:rPr>
-          <w:t xml:space="preserve">https://www.cos.io/blog/cos-and-forrt-partner-to-increase-discoverability-and-usability-of-replication-evidence</w:t>
-        </w:r>
-      </w:hyperlink>
-    </w:p>
-    <w:bookmarkEnd w:id="67"/>
-    <w:bookmarkStart w:id="69" w:name="ref-Dreber2015"/>
-    <w:p>
-      <w:pPr>
-        <w:pStyle w:val="Literaturverzeichnis"/>
-      </w:pPr>
-      <w:r>
-        <w:t xml:space="preserve">Dreber, A., Pfeiffer, T., Almenberg, J., Isaksson, S., Wilson, B., Chen, Y., … Johannesson, M. (2015). Using prediction markets to estimate the reproducibility of scientific research.</w:t>
-      </w:r>
-      <w:r>
-        <w:t xml:space="preserve"> </w:t>
-      </w:r>
-      <w:r>
-        <w:rPr>
-          <w:i/>
-          <w:iCs/>
-        </w:rPr>
-        <w:t xml:space="preserve">Proceedings of the National Academy of Sciences</w:t>
-      </w:r>
-      <w:r>
-        <w:t xml:space="preserve">,</w:t>
-      </w:r>
-      <w:r>
-        <w:t xml:space="preserve"> </w:t>
-      </w:r>
-      <w:r>
-        <w:rPr>
-          <w:i/>
-          <w:iCs/>
-        </w:rPr>
-        <w:t xml:space="preserve">112</w:t>
-      </w:r>
-      <w:r>
-        <w:t xml:space="preserve">(50), 15343–15347.</w:t>
-      </w:r>
-      <w:r>
-        <w:t xml:space="preserve"> </w:t>
-      </w:r>
-      <w:hyperlink r:id="rId68">
         <w:r>
           <w:rPr>
             <w:rStyle w:val="Hyperlink"/>
@@ -3068,8 +2989,8 @@
         </w:r>
       </w:hyperlink>
     </w:p>
-    <w:bookmarkEnd w:id="69"/>
-    <w:bookmarkStart w:id="71" w:name="ref-osc2015"/>
+    <w:bookmarkEnd w:id="67"/>
+    <w:bookmarkStart w:id="69" w:name="ref-osc2015"/>
     <w:p>
       <w:pPr>
         <w:pStyle w:val="Literaturverzeichnis"/>
@@ -3106,7 +3027,7 @@
       <w:r>
         <w:t xml:space="preserve"> </w:t>
       </w:r>
-      <w:hyperlink r:id="rId70">
+      <w:hyperlink r:id="rId68">
         <w:r>
           <w:rPr>
             <w:rStyle w:val="Hyperlink"/>
@@ -3115,8 +3036,8 @@
         </w:r>
       </w:hyperlink>
     </w:p>
-    <w:bookmarkEnd w:id="71"/>
-    <w:bookmarkStart w:id="73" w:name="ref-Forsell2019"/>
+    <w:bookmarkEnd w:id="69"/>
+    <w:bookmarkStart w:id="71" w:name="ref-Forsell2019"/>
     <w:p>
       <w:pPr>
         <w:pStyle w:val="Literaturverzeichnis"/>
@@ -3153,7 +3074,7 @@
       <w:r>
         <w:t xml:space="preserve"> </w:t>
       </w:r>
-      <w:hyperlink r:id="rId72">
+      <w:hyperlink r:id="rId70">
         <w:r>
           <w:rPr>
             <w:rStyle w:val="Hyperlink"/>
@@ -3162,8 +3083,8 @@
         </w:r>
       </w:hyperlink>
     </w:p>
-    <w:bookmarkEnd w:id="73"/>
-    <w:bookmarkStart w:id="75" w:name="ref-R-car"/>
+    <w:bookmarkEnd w:id="71"/>
+    <w:bookmarkStart w:id="73" w:name="ref-R-car"/>
     <w:p>
       <w:pPr>
         <w:pStyle w:val="Literaturverzeichnis"/>
@@ -3227,7 +3148,7 @@
       <w:r>
         <w:t xml:space="preserve"> </w:t>
       </w:r>
-      <w:hyperlink r:id="rId74">
+      <w:hyperlink r:id="rId72">
         <w:r>
           <w:rPr>
             <w:rStyle w:val="Hyperlink"/>
@@ -3236,8 +3157,8 @@
         </w:r>
       </w:hyperlink>
     </w:p>
-    <w:bookmarkEnd w:id="75"/>
-    <w:bookmarkStart w:id="77" w:name="ref-R-carData"/>
+    <w:bookmarkEnd w:id="73"/>
+    <w:bookmarkStart w:id="75" w:name="ref-R-carData"/>
     <w:p>
       <w:pPr>
         <w:pStyle w:val="Literaturverzeichnis"/>
@@ -3261,7 +3182,7 @@
       <w:r>
         <w:t xml:space="preserve"> </w:t>
       </w:r>
-      <w:hyperlink r:id="rId76">
+      <w:hyperlink r:id="rId74">
         <w:r>
           <w:rPr>
             <w:rStyle w:val="Hyperlink"/>
@@ -3270,8 +3191,8 @@
         </w:r>
       </w:hyperlink>
     </w:p>
-    <w:bookmarkEnd w:id="77"/>
-    <w:bookmarkStart w:id="79" w:name="ref-Friese2018"/>
+    <w:bookmarkEnd w:id="75"/>
+    <w:bookmarkStart w:id="77" w:name="ref-Friese2018"/>
     <w:p>
       <w:pPr>
         <w:pStyle w:val="Literaturverzeichnis"/>
@@ -3308,7 +3229,7 @@
       <w:r>
         <w:t xml:space="preserve"> </w:t>
       </w:r>
-      <w:hyperlink r:id="rId78">
+      <w:hyperlink r:id="rId76">
         <w:r>
           <w:rPr>
             <w:rStyle w:val="Hyperlink"/>
@@ -3317,8 +3238,8 @@
         </w:r>
       </w:hyperlink>
     </w:p>
-    <w:bookmarkEnd w:id="79"/>
-    <w:bookmarkStart w:id="81" w:name="ref-R-flextable"/>
+    <w:bookmarkEnd w:id="77"/>
+    <w:bookmarkStart w:id="79" w:name="ref-R-flextable"/>
     <w:p>
       <w:pPr>
         <w:pStyle w:val="Literaturverzeichnis"/>
@@ -3342,7 +3263,7 @@
       <w:r>
         <w:t xml:space="preserve"> </w:t>
       </w:r>
-      <w:hyperlink r:id="rId80">
+      <w:hyperlink r:id="rId78">
         <w:r>
           <w:rPr>
             <w:rStyle w:val="Hyperlink"/>
@@ -3351,8 +3272,8 @@
         </w:r>
       </w:hyperlink>
     </w:p>
-    <w:bookmarkEnd w:id="81"/>
-    <w:bookmarkStart w:id="83" w:name="ref-Gordon2021"/>
+    <w:bookmarkEnd w:id="79"/>
+    <w:bookmarkStart w:id="81" w:name="ref-Gordon2021"/>
     <w:p>
       <w:pPr>
         <w:pStyle w:val="Literaturverzeichnis"/>
@@ -3389,7 +3310,7 @@
       <w:r>
         <w:t xml:space="preserve"> </w:t>
       </w:r>
-      <w:hyperlink r:id="rId82">
+      <w:hyperlink r:id="rId80">
         <w:r>
           <w:rPr>
             <w:rStyle w:val="Hyperlink"/>
@@ -3398,8 +3319,8 @@
         </w:r>
       </w:hyperlink>
     </w:p>
-    <w:bookmarkEnd w:id="83"/>
-    <w:bookmarkStart w:id="85" w:name="ref-R-lubridate"/>
+    <w:bookmarkEnd w:id="81"/>
+    <w:bookmarkStart w:id="83" w:name="ref-R-lubridate"/>
     <w:p>
       <w:pPr>
         <w:pStyle w:val="Literaturverzeichnis"/>
@@ -3445,7 +3366,7 @@
       <w:r>
         <w:t xml:space="preserve"> </w:t>
       </w:r>
-      <w:hyperlink r:id="rId84">
+      <w:hyperlink r:id="rId82">
         <w:r>
           <w:rPr>
             <w:rStyle w:val="Hyperlink"/>
@@ -3454,8 +3375,8 @@
         </w:r>
       </w:hyperlink>
     </w:p>
-    <w:bookmarkEnd w:id="85"/>
-    <w:bookmarkStart w:id="87" w:name="ref-Hardwicke2021"/>
+    <w:bookmarkEnd w:id="83"/>
+    <w:bookmarkStart w:id="85" w:name="ref-Hardwicke2021"/>
     <w:p>
       <w:pPr>
         <w:pStyle w:val="Literaturverzeichnis"/>
@@ -3492,7 +3413,7 @@
       <w:r>
         <w:t xml:space="preserve"> </w:t>
       </w:r>
-      <w:hyperlink r:id="rId86">
+      <w:hyperlink r:id="rId84">
         <w:r>
           <w:rPr>
             <w:rStyle w:val="Hyperlink"/>
@@ -3501,8 +3422,8 @@
         </w:r>
       </w:hyperlink>
     </w:p>
-    <w:bookmarkEnd w:id="87"/>
-    <w:bookmarkStart w:id="89" w:name="ref-Hecht1998"/>
+    <w:bookmarkEnd w:id="85"/>
+    <w:bookmarkStart w:id="87" w:name="ref-Hecht1998"/>
     <w:p>
       <w:pPr>
         <w:pStyle w:val="Literaturverzeichnis"/>
@@ -3545,7 +3466,7 @@
       <w:r>
         <w:t xml:space="preserve"> </w:t>
       </w:r>
-      <w:hyperlink r:id="rId88">
+      <w:hyperlink r:id="rId86">
         <w:r>
           <w:rPr>
             <w:rStyle w:val="Hyperlink"/>
@@ -3554,8 +3475,8 @@
         </w:r>
       </w:hyperlink>
     </w:p>
-    <w:bookmarkEnd w:id="89"/>
-    <w:bookmarkStart w:id="91" w:name="ref-Hendricks2020"/>
+    <w:bookmarkEnd w:id="87"/>
+    <w:bookmarkStart w:id="89" w:name="ref-Hendricks2020"/>
     <w:p>
       <w:pPr>
         <w:pStyle w:val="Literaturverzeichnis"/>
@@ -3592,7 +3513,7 @@
       <w:r>
         <w:t xml:space="preserve"> </w:t>
       </w:r>
-      <w:hyperlink r:id="rId90">
+      <w:hyperlink r:id="rId88">
         <w:r>
           <w:rPr>
             <w:rStyle w:val="Hyperlink"/>
@@ -3601,8 +3522,8 @@
         </w:r>
       </w:hyperlink>
     </w:p>
-    <w:bookmarkEnd w:id="91"/>
-    <w:bookmarkStart w:id="93" w:name="ref-Hussey2026"/>
+    <w:bookmarkEnd w:id="89"/>
+    <w:bookmarkStart w:id="91" w:name="ref-Hussey2026"/>
     <w:p>
       <w:pPr>
         <w:pStyle w:val="Literaturverzeichnis"/>
@@ -3626,7 +3547,7 @@
       <w:r>
         <w:t xml:space="preserve"> </w:t>
       </w:r>
-      <w:hyperlink r:id="rId92">
+      <w:hyperlink r:id="rId90">
         <w:r>
           <w:rPr>
             <w:rStyle w:val="Hyperlink"/>
@@ -3635,8 +3556,8 @@
         </w:r>
       </w:hyperlink>
     </w:p>
-    <w:bookmarkEnd w:id="93"/>
-    <w:bookmarkStart w:id="95" w:name="ref-R-ggpubr"/>
+    <w:bookmarkEnd w:id="91"/>
+    <w:bookmarkStart w:id="93" w:name="ref-R-ggpubr"/>
     <w:p>
       <w:pPr>
         <w:pStyle w:val="Literaturverzeichnis"/>
@@ -3660,7 +3581,7 @@
       <w:r>
         <w:t xml:space="preserve"> </w:t>
       </w:r>
-      <w:hyperlink r:id="rId94">
+      <w:hyperlink r:id="rId92">
         <w:r>
           <w:rPr>
             <w:rStyle w:val="Hyperlink"/>
@@ -3669,8 +3590,8 @@
         </w:r>
       </w:hyperlink>
     </w:p>
-    <w:bookmarkEnd w:id="95"/>
-    <w:bookmarkStart w:id="97" w:name="ref-King1995"/>
+    <w:bookmarkEnd w:id="93"/>
+    <w:bookmarkStart w:id="95" w:name="ref-King1995"/>
     <w:p>
       <w:pPr>
         <w:pStyle w:val="Literaturverzeichnis"/>
@@ -3707,7 +3628,7 @@
       <w:r>
         <w:t xml:space="preserve"> </w:t>
       </w:r>
-      <w:hyperlink r:id="rId96">
+      <w:hyperlink r:id="rId94">
         <w:r>
           <w:rPr>
             <w:rStyle w:val="Hyperlink"/>
@@ -3716,8 +3637,8 @@
         </w:r>
       </w:hyperlink>
     </w:p>
-    <w:bookmarkEnd w:id="97"/>
-    <w:bookmarkStart w:id="99" w:name="ref-R-tibble"/>
+    <w:bookmarkEnd w:id="95"/>
+    <w:bookmarkStart w:id="97" w:name="ref-R-tibble"/>
     <w:p>
       <w:pPr>
         <w:pStyle w:val="Literaturverzeichnis"/>
@@ -3741,7 +3662,7 @@
       <w:r>
         <w:t xml:space="preserve"> </w:t>
       </w:r>
-      <w:hyperlink r:id="rId98">
+      <w:hyperlink r:id="rId96">
         <w:r>
           <w:rPr>
             <w:rStyle w:val="Hyperlink"/>
@@ -3750,8 +3671,8 @@
         </w:r>
       </w:hyperlink>
     </w:p>
-    <w:bookmarkEnd w:id="99"/>
-    <w:bookmarkStart w:id="101" w:name="ref-nosek2013call"/>
+    <w:bookmarkEnd w:id="97"/>
+    <w:bookmarkStart w:id="99" w:name="ref-nosek2013call"/>
     <w:p>
       <w:pPr>
         <w:pStyle w:val="Literaturverzeichnis"/>
@@ -3794,7 +3715,7 @@
       <w:r>
         <w:t xml:space="preserve"> </w:t>
       </w:r>
-      <w:hyperlink r:id="rId100">
+      <w:hyperlink r:id="rId98">
         <w:r>
           <w:rPr>
             <w:rStyle w:val="Hyperlink"/>
@@ -3803,8 +3724,8 @@
         </w:r>
       </w:hyperlink>
     </w:p>
-    <w:bookmarkEnd w:id="101"/>
-    <w:bookmarkStart w:id="103" w:name="ref-R-prmisc"/>
+    <w:bookmarkEnd w:id="99"/>
+    <w:bookmarkStart w:id="101" w:name="ref-R-prmisc"/>
     <w:p>
       <w:pPr>
         <w:pStyle w:val="Literaturverzeichnis"/>
@@ -3828,7 +3749,7 @@
       <w:r>
         <w:t xml:space="preserve"> </w:t>
       </w:r>
-      <w:hyperlink r:id="rId102">
+      <w:hyperlink r:id="rId100">
         <w:r>
           <w:rPr>
             <w:rStyle w:val="Hyperlink"/>
@@ -3837,8 +3758,8 @@
         </w:r>
       </w:hyperlink>
     </w:p>
-    <w:bookmarkEnd w:id="103"/>
-    <w:bookmarkStart w:id="105" w:name="ref-R-patchwork"/>
+    <w:bookmarkEnd w:id="101"/>
+    <w:bookmarkStart w:id="103" w:name="ref-R-patchwork"/>
     <w:p>
       <w:pPr>
         <w:pStyle w:val="Literaturverzeichnis"/>
@@ -3862,7 +3783,7 @@
       <w:r>
         <w:t xml:space="preserve"> </w:t>
       </w:r>
-      <w:hyperlink r:id="rId104">
+      <w:hyperlink r:id="rId102">
         <w:r>
           <w:rPr>
             <w:rStyle w:val="Hyperlink"/>
@@ -3871,8 +3792,8 @@
         </w:r>
       </w:hyperlink>
     </w:p>
-    <w:bookmarkEnd w:id="105"/>
-    <w:bookmarkStart w:id="107" w:name="X445f924e279bcb4a7e804925bb44a75944986c4"/>
+    <w:bookmarkEnd w:id="103"/>
+    <w:bookmarkStart w:id="105" w:name="X445f924e279bcb4a7e804925bb44a75944986c4"/>
     <w:p>
       <w:pPr>
         <w:pStyle w:val="Literaturverzeichnis"/>
@@ -3896,7 +3817,7 @@
       <w:r>
         <w:t xml:space="preserve"> </w:t>
       </w:r>
-      <w:hyperlink r:id="rId106">
+      <w:hyperlink r:id="rId104">
         <w:r>
           <w:rPr>
             <w:rStyle w:val="Hyperlink"/>
@@ -3905,8 +3826,8 @@
         </w:r>
       </w:hyperlink>
     </w:p>
-    <w:bookmarkEnd w:id="107"/>
-    <w:bookmarkStart w:id="109" w:name="ref-R-base"/>
+    <w:bookmarkEnd w:id="105"/>
+    <w:bookmarkStart w:id="107" w:name="ref-R-base"/>
     <w:p>
       <w:pPr>
         <w:pStyle w:val="Literaturverzeichnis"/>
@@ -3930,7 +3851,7 @@
       <w:r>
         <w:t xml:space="preserve"> </w:t>
       </w:r>
-      <w:hyperlink r:id="rId108">
+      <w:hyperlink r:id="rId106">
         <w:r>
           <w:rPr>
             <w:rStyle w:val="Hyperlink"/>
@@ -3939,8 +3860,8 @@
         </w:r>
       </w:hyperlink>
     </w:p>
-    <w:bookmarkEnd w:id="109"/>
-    <w:bookmarkStart w:id="111" w:name="ref-R-grateful"/>
+    <w:bookmarkEnd w:id="107"/>
+    <w:bookmarkStart w:id="109" w:name="ref-R-grateful"/>
     <w:p>
       <w:pPr>
         <w:pStyle w:val="Literaturverzeichnis"/>
@@ -3992,7 +3913,7 @@
       <w:r>
         <w:t xml:space="preserve"> </w:t>
       </w:r>
-      <w:hyperlink r:id="rId110">
+      <w:hyperlink r:id="rId108">
         <w:r>
           <w:rPr>
             <w:rStyle w:val="Hyperlink"/>
@@ -4001,8 +3922,8 @@
         </w:r>
       </w:hyperlink>
     </w:p>
-    <w:bookmarkEnd w:id="111"/>
-    <w:bookmarkStart w:id="113" w:name="ref-handbook"/>
+    <w:bookmarkEnd w:id="109"/>
+    <w:bookmarkStart w:id="111" w:name="ref-handbook"/>
     <w:p>
       <w:pPr>
         <w:pStyle w:val="Literaturverzeichnis"/>
@@ -4026,7 +3947,7 @@
       <w:r>
         <w:t xml:space="preserve"> </w:t>
       </w:r>
-      <w:hyperlink r:id="rId112">
+      <w:hyperlink r:id="rId110">
         <w:r>
           <w:rPr>
             <w:rStyle w:val="Hyperlink"/>
@@ -4035,8 +3956,8 @@
         </w:r>
       </w:hyperlink>
     </w:p>
-    <w:bookmarkEnd w:id="113"/>
-    <w:bookmarkStart w:id="115" w:name="ref-R-FReD"/>
+    <w:bookmarkEnd w:id="111"/>
+    <w:bookmarkStart w:id="113" w:name="ref-R-FReD"/>
     <w:p>
       <w:pPr>
         <w:pStyle w:val="Literaturverzeichnis"/>
@@ -4060,7 +3981,7 @@
       <w:r>
         <w:t xml:space="preserve"> </w:t>
       </w:r>
-      <w:hyperlink r:id="rId114">
+      <w:hyperlink r:id="rId112">
         <w:r>
           <w:rPr>
             <w:rStyle w:val="Hyperlink"/>
@@ -4069,8 +3990,8 @@
         </w:r>
       </w:hyperlink>
     </w:p>
-    <w:bookmarkEnd w:id="115"/>
-    <w:bookmarkStart w:id="117" w:name="ref-R-openxlsx"/>
+    <w:bookmarkEnd w:id="113"/>
+    <w:bookmarkStart w:id="115" w:name="ref-R-openxlsx"/>
     <w:p>
       <w:pPr>
         <w:pStyle w:val="Literaturverzeichnis"/>
@@ -4094,7 +4015,7 @@
       <w:r>
         <w:t xml:space="preserve"> </w:t>
       </w:r>
-      <w:hyperlink r:id="rId116">
+      <w:hyperlink r:id="rId114">
         <w:r>
           <w:rPr>
             <w:rStyle w:val="Hyperlink"/>
@@ -4103,8 +4024,8 @@
         </w:r>
       </w:hyperlink>
     </w:p>
-    <w:bookmarkEnd w:id="117"/>
-    <w:bookmarkStart w:id="119" w:name="ref-Simons2008"/>
+    <w:bookmarkEnd w:id="115"/>
+    <w:bookmarkStart w:id="117" w:name="ref-Simons2008"/>
     <w:p>
       <w:pPr>
         <w:pStyle w:val="Literaturverzeichnis"/>
@@ -4141,7 +4062,7 @@
       <w:r>
         <w:t xml:space="preserve"> </w:t>
       </w:r>
-      <w:hyperlink r:id="rId118">
+      <w:hyperlink r:id="rId116">
         <w:r>
           <w:rPr>
             <w:rStyle w:val="Hyperlink"/>
@@ -4150,8 +4071,8 @@
         </w:r>
       </w:hyperlink>
     </w:p>
-    <w:bookmarkEnd w:id="119"/>
-    <w:bookmarkStart w:id="121" w:name="ref-R-apaTables"/>
+    <w:bookmarkEnd w:id="117"/>
+    <w:bookmarkStart w:id="119" w:name="ref-R-apaTables"/>
     <w:p>
       <w:pPr>
         <w:pStyle w:val="Literaturverzeichnis"/>
@@ -4175,7 +4096,7 @@
       <w:r>
         <w:t xml:space="preserve"> </w:t>
       </w:r>
-      <w:hyperlink r:id="rId120">
+      <w:hyperlink r:id="rId118">
         <w:r>
           <w:rPr>
             <w:rStyle w:val="Hyperlink"/>
@@ -4184,8 +4105,8 @@
         </w:r>
       </w:hyperlink>
     </w:p>
-    <w:bookmarkEnd w:id="121"/>
-    <w:bookmarkStart w:id="123" w:name="ref-Topolinski2011"/>
+    <w:bookmarkEnd w:id="119"/>
+    <w:bookmarkStart w:id="121" w:name="ref-Topolinski2011"/>
     <w:p>
       <w:pPr>
         <w:pStyle w:val="Literaturverzeichnis"/>
@@ -4222,7 +4143,7 @@
       <w:r>
         <w:t xml:space="preserve"> </w:t>
       </w:r>
-      <w:hyperlink r:id="rId122">
+      <w:hyperlink r:id="rId120">
         <w:r>
           <w:rPr>
             <w:rStyle w:val="Hyperlink"/>
@@ -4231,8 +4152,8 @@
         </w:r>
       </w:hyperlink>
     </w:p>
-    <w:bookmarkEnd w:id="123"/>
-    <w:bookmarkStart w:id="125" w:name="ref-Wagenmakers2015"/>
+    <w:bookmarkEnd w:id="121"/>
+    <w:bookmarkStart w:id="123" w:name="ref-Wagenmakers2015"/>
     <w:p>
       <w:pPr>
         <w:pStyle w:val="Literaturverzeichnis"/>
@@ -4269,7 +4190,7 @@
       <w:r>
         <w:t xml:space="preserve"> </w:t>
       </w:r>
-      <w:hyperlink r:id="rId124">
+      <w:hyperlink r:id="rId122">
         <w:r>
           <w:rPr>
             <w:rStyle w:val="Hyperlink"/>
@@ -4278,8 +4199,8 @@
         </w:r>
       </w:hyperlink>
     </w:p>
-    <w:bookmarkEnd w:id="125"/>
-    <w:bookmarkStart w:id="127" w:name="ref-wallrich2026flora"/>
+    <w:bookmarkEnd w:id="123"/>
+    <w:bookmarkStart w:id="125" w:name="ref-wallrich2026flora"/>
     <w:p>
       <w:pPr>
         <w:pStyle w:val="Literaturverzeichnis"/>
@@ -4334,7 +4255,7 @@
       <w:r>
         <w:t xml:space="preserve"> </w:t>
       </w:r>
-      <w:hyperlink r:id="rId126">
+      <w:hyperlink r:id="rId124">
         <w:r>
           <w:rPr>
             <w:rStyle w:val="Hyperlink"/>
@@ -4343,8 +4264,8 @@
         </w:r>
       </w:hyperlink>
     </w:p>
-    <w:bookmarkEnd w:id="127"/>
-    <w:bookmarkStart w:id="129" w:name="ref-R-ggplot2"/>
+    <w:bookmarkEnd w:id="125"/>
+    <w:bookmarkStart w:id="127" w:name="ref-R-ggplot2"/>
     <w:p>
       <w:pPr>
         <w:pStyle w:val="Literaturverzeichnis"/>
@@ -4368,7 +4289,7 @@
       <w:r>
         <w:t xml:space="preserve"> </w:t>
       </w:r>
-      <w:hyperlink r:id="rId128">
+      <w:hyperlink r:id="rId126">
         <w:r>
           <w:rPr>
             <w:rStyle w:val="Hyperlink"/>
@@ -4377,8 +4298,8 @@
         </w:r>
       </w:hyperlink>
     </w:p>
-    <w:bookmarkEnd w:id="129"/>
-    <w:bookmarkStart w:id="131" w:name="ref-R-forcats"/>
+    <w:bookmarkEnd w:id="127"/>
+    <w:bookmarkStart w:id="129" w:name="ref-R-forcats"/>
     <w:p>
       <w:pPr>
         <w:pStyle w:val="Literaturverzeichnis"/>
@@ -4402,7 +4323,7 @@
       <w:r>
         <w:t xml:space="preserve"> </w:t>
       </w:r>
-      <w:hyperlink r:id="rId130">
+      <w:hyperlink r:id="rId128">
         <w:r>
           <w:rPr>
             <w:rStyle w:val="Hyperlink"/>
@@ -4411,8 +4332,8 @@
         </w:r>
       </w:hyperlink>
     </w:p>
-    <w:bookmarkEnd w:id="131"/>
-    <w:bookmarkStart w:id="133" w:name="ref-R-stringr"/>
+    <w:bookmarkEnd w:id="129"/>
+    <w:bookmarkStart w:id="131" w:name="ref-R-stringr"/>
     <w:p>
       <w:pPr>
         <w:pStyle w:val="Literaturverzeichnis"/>
@@ -4436,7 +4357,7 @@
       <w:r>
         <w:t xml:space="preserve"> </w:t>
       </w:r>
-      <w:hyperlink r:id="rId132">
+      <w:hyperlink r:id="rId130">
         <w:r>
           <w:rPr>
             <w:rStyle w:val="Hyperlink"/>
@@ -4445,8 +4366,8 @@
         </w:r>
       </w:hyperlink>
     </w:p>
-    <w:bookmarkEnd w:id="133"/>
-    <w:bookmarkStart w:id="135" w:name="ref-R-tidyverse"/>
+    <w:bookmarkEnd w:id="131"/>
+    <w:bookmarkStart w:id="133" w:name="ref-R-tidyverse"/>
     <w:p>
       <w:pPr>
         <w:pStyle w:val="Literaturverzeichnis"/>
@@ -4492,7 +4413,7 @@
       <w:r>
         <w:t xml:space="preserve"> </w:t>
       </w:r>
-      <w:hyperlink r:id="rId134">
+      <w:hyperlink r:id="rId132">
         <w:r>
           <w:rPr>
             <w:rStyle w:val="Hyperlink"/>
@@ -4501,8 +4422,8 @@
         </w:r>
       </w:hyperlink>
     </w:p>
-    <w:bookmarkEnd w:id="135"/>
-    <w:bookmarkStart w:id="136" w:name="ref-R-usethis"/>
+    <w:bookmarkEnd w:id="133"/>
+    <w:bookmarkStart w:id="134" w:name="ref-R-usethis"/>
     <w:p>
       <w:pPr>
         <w:pStyle w:val="Literaturverzeichnis"/>
@@ -4524,8 +4445,8 @@
         <w:t xml:space="preserve">.</w:t>
       </w:r>
     </w:p>
-    <w:bookmarkEnd w:id="136"/>
-    <w:bookmarkStart w:id="138" w:name="ref-R-dplyr"/>
+    <w:bookmarkEnd w:id="134"/>
+    <w:bookmarkStart w:id="136" w:name="ref-R-dplyr"/>
     <w:p>
       <w:pPr>
         <w:pStyle w:val="Literaturverzeichnis"/>
@@ -4549,7 +4470,7 @@
       <w:r>
         <w:t xml:space="preserve"> </w:t>
       </w:r>
-      <w:hyperlink r:id="rId137">
+      <w:hyperlink r:id="rId135">
         <w:r>
           <w:rPr>
             <w:rStyle w:val="Hyperlink"/>
@@ -4558,8 +4479,8 @@
         </w:r>
       </w:hyperlink>
     </w:p>
-    <w:bookmarkEnd w:id="138"/>
-    <w:bookmarkStart w:id="140" w:name="ref-R-purrr"/>
+    <w:bookmarkEnd w:id="136"/>
+    <w:bookmarkStart w:id="138" w:name="ref-R-purrr"/>
     <w:p>
       <w:pPr>
         <w:pStyle w:val="Literaturverzeichnis"/>
@@ -4583,7 +4504,7 @@
       <w:r>
         <w:t xml:space="preserve"> </w:t>
       </w:r>
-      <w:hyperlink r:id="rId139">
+      <w:hyperlink r:id="rId137">
         <w:r>
           <w:rPr>
             <w:rStyle w:val="Hyperlink"/>
@@ -4592,8 +4513,8 @@
         </w:r>
       </w:hyperlink>
     </w:p>
-    <w:bookmarkEnd w:id="140"/>
-    <w:bookmarkStart w:id="142" w:name="ref-R-readr"/>
+    <w:bookmarkEnd w:id="138"/>
+    <w:bookmarkStart w:id="140" w:name="ref-R-readr"/>
     <w:p>
       <w:pPr>
         <w:pStyle w:val="Literaturverzeichnis"/>
@@ -4617,7 +4538,7 @@
       <w:r>
         <w:t xml:space="preserve"> </w:t>
       </w:r>
-      <w:hyperlink r:id="rId141">
+      <w:hyperlink r:id="rId139">
         <w:r>
           <w:rPr>
             <w:rStyle w:val="Hyperlink"/>
@@ -4626,8 +4547,8 @@
         </w:r>
       </w:hyperlink>
     </w:p>
-    <w:bookmarkEnd w:id="142"/>
-    <w:bookmarkStart w:id="144" w:name="ref-R-devtools"/>
+    <w:bookmarkEnd w:id="140"/>
+    <w:bookmarkStart w:id="142" w:name="ref-R-devtools"/>
     <w:p>
       <w:pPr>
         <w:pStyle w:val="Literaturverzeichnis"/>
@@ -4651,7 +4572,7 @@
       <w:r>
         <w:t xml:space="preserve"> </w:t>
       </w:r>
-      <w:hyperlink r:id="rId143">
+      <w:hyperlink r:id="rId141">
         <w:r>
           <w:rPr>
             <w:rStyle w:val="Hyperlink"/>
@@ -4660,8 +4581,8 @@
         </w:r>
       </w:hyperlink>
     </w:p>
-    <w:bookmarkEnd w:id="144"/>
-    <w:bookmarkStart w:id="146" w:name="ref-R-tidyr"/>
+    <w:bookmarkEnd w:id="142"/>
+    <w:bookmarkStart w:id="144" w:name="ref-R-tidyr"/>
     <w:p>
       <w:pPr>
         <w:pStyle w:val="Literaturverzeichnis"/>
@@ -4685,7 +4606,7 @@
       <w:r>
         <w:t xml:space="preserve"> </w:t>
       </w:r>
-      <w:hyperlink r:id="rId145">
+      <w:hyperlink r:id="rId143">
         <w:r>
           <w:rPr>
             <w:rStyle w:val="Hyperlink"/>
@@ -4694,8 +4615,8 @@
         </w:r>
       </w:hyperlink>
     </w:p>
-    <w:bookmarkEnd w:id="146"/>
-    <w:bookmarkStart w:id="148" w:name="ref-R-cowplot"/>
+    <w:bookmarkEnd w:id="144"/>
+    <w:bookmarkStart w:id="146" w:name="ref-R-cowplot"/>
     <w:p>
       <w:pPr>
         <w:pStyle w:val="Literaturverzeichnis"/>
@@ -4719,7 +4640,7 @@
       <w:r>
         <w:t xml:space="preserve"> </w:t>
       </w:r>
-      <w:hyperlink r:id="rId147">
+      <w:hyperlink r:id="rId145">
         <w:r>
           <w:rPr>
             <w:rStyle w:val="Hyperlink"/>
@@ -4728,8 +4649,8 @@
         </w:r>
       </w:hyperlink>
     </w:p>
-    <w:bookmarkEnd w:id="148"/>
-    <w:bookmarkStart w:id="150" w:name="ref-R-psych"/>
+    <w:bookmarkEnd w:id="146"/>
+    <w:bookmarkStart w:id="148" w:name="ref-R-psych"/>
     <w:p>
       <w:pPr>
         <w:pStyle w:val="Literaturverzeichnis"/>
@@ -4753,7 +4674,7 @@
       <w:r>
         <w:t xml:space="preserve"> </w:t>
       </w:r>
-      <w:hyperlink r:id="rId149">
+      <w:hyperlink r:id="rId147">
         <w:r>
           <w:rPr>
             <w:rStyle w:val="Hyperlink"/>
@@ -4762,8 +4683,8 @@
         </w:r>
       </w:hyperlink>
     </w:p>
-    <w:bookmarkEnd w:id="150"/>
-    <w:bookmarkStart w:id="152" w:name="ref-R-kableExtra"/>
+    <w:bookmarkEnd w:id="148"/>
+    <w:bookmarkStart w:id="150" w:name="ref-R-kableExtra"/>
     <w:p>
       <w:pPr>
         <w:pStyle w:val="Literaturverzeichnis"/>
@@ -4787,7 +4708,7 @@
       <w:r>
         <w:t xml:space="preserve"> </w:t>
       </w:r>
-      <w:hyperlink r:id="rId151">
+      <w:hyperlink r:id="rId149">
         <w:r>
           <w:rPr>
             <w:rStyle w:val="Hyperlink"/>
@@ -4796,24 +4717,24 @@
         </w:r>
       </w:hyperlink>
     </w:p>
+    <w:bookmarkEnd w:id="150"/>
+    <w:bookmarkEnd w:id="151"/>
+    <w:p>
+      <w:r>
+        <w:br w:type="page"/>
+      </w:r>
+    </w:p>
     <w:bookmarkEnd w:id="152"/>
+    <w:bookmarkStart w:id="153" w:name="appendix-appendix"/>
+    <w:p>
+      <w:pPr>
+        <w:pStyle w:val="berschrift1"/>
+      </w:pPr>
+      <w:r>
+        <w:t xml:space="preserve">(APPENDIX) Appendix</w:t>
+      </w:r>
+    </w:p>
     <w:bookmarkEnd w:id="153"/>
-    <w:p>
-      <w:r>
-        <w:br w:type="page"/>
-      </w:r>
-    </w:p>
-    <w:bookmarkEnd w:id="154"/>
-    <w:bookmarkStart w:id="155" w:name="appendix-appendix"/>
-    <w:p>
-      <w:pPr>
-        <w:pStyle w:val="berschrift1"/>
-      </w:pPr>
-      <w:r>
-        <w:t xml:space="preserve">(APPENDIX) Appendix</w:t>
-      </w:r>
-    </w:p>
-    <w:bookmarkEnd w:id="155"/>
     <w:sectPr>
       <w:headerReference r:id="rId9" w:type="even"/>
       <w:headerReference r:id="rId11" w:type="default"/>

</xml_diff>

<commit_message>
Fixed study numbers, new render
</commit_message>
<xml_diff>
--- a/Report/00_guther_main.docx
+++ b/Report/00_guther_main.docx
@@ -143,7 +143,7 @@
         <w:t xml:space="preserve"> </w:t>
       </w:r>
       <w:r>
-        <w:t xml:space="preserve">(GutheR). On a subset of N = 1,234 studies that were either successfully or not successfully replicated (mixed results and reproductions were excluded), higher mean citedness was associated with a higher risk of replication failure but the relationship was too small to be practically relevant. Researchers [relied/did not rely] on mean citedness in their prediction. Higher mean citedness of the journal that published the original study were [not] associated with a higher probability of predicted success. This relationship was [different/similar] for non-researchers. We discuss the use of citation metrics as proxies for research quality.</w:t>
+        <w:t xml:space="preserve">(GutheR). On a subset of N = 1,235 studies that were either successfully or not successfully replicated (mixed results and reproductions were excluded), higher mean citedness was associated with a higher risk of replication failure but the relationship was too small to be practically relevant. Researchers [relied/did not rely] on mean citedness in their prediction. Higher mean citedness of the journal that published the original study were [not] associated with a higher probability of predicted success. This relationship was [different/similar] for non-researchers. We discuss the use of citation metrics as proxies for research quality.</w:t>
       </w:r>
     </w:p>
     <w:p>
@@ -3466,13 +3466,13 @@
         <w:t xml:space="preserve">(Papenberg &amp; Nagel, 2025)</w:t>
       </w:r>
       <w:r>
-        <w:t xml:space="preserve">, and audible</w:t>
-      </w:r>
-      <w:r>
-        <w:t xml:space="preserve"> </w:t>
-      </w:r>
-      <w:r>
-        <w:t xml:space="preserve">cues during long computations were produced with</w:t>
+        <w:t xml:space="preserve">. Figures were</w:t>
+      </w:r>
+      <w:r>
+        <w:t xml:space="preserve"> </w:t>
+      </w:r>
+      <w:r>
+        <w:t xml:space="preserve">produced with</w:t>
       </w:r>
       <w:r>
         <w:t xml:space="preserve"> </w:t>
@@ -3481,32 +3481,19 @@
         <w:rPr>
           <w:rStyle w:val="VerbatimChar"/>
         </w:rPr>
-        <w:t xml:space="preserve">beepr</w:t>
-      </w:r>
-      <w:r>
-        <w:t xml:space="preserve"> </w:t>
-      </w:r>
-      <w:r>
-        <w:t xml:space="preserve">(</w:t>
-      </w:r>
-      <w:r>
-        <w:rPr>
-          <w:b/>
-          <w:bCs/>
-        </w:rPr>
-        <w:t xml:space="preserve">R-beepr?</w:t>
-      </w:r>
-      <w:r>
-        <w:t xml:space="preserve">)</w:t>
-      </w:r>
-      <w:r>
-        <w:t xml:space="preserve">.</w:t>
-      </w:r>
-      <w:r>
-        <w:t xml:space="preserve"> </w:t>
-      </w:r>
-      <w:r>
-        <w:t xml:space="preserve">Figures were produced with</w:t>
+        <w:t xml:space="preserve">ggplot2</w:t>
+      </w:r>
+      <w:r>
+        <w:t xml:space="preserve"> </w:t>
+      </w:r>
+      <w:r>
+        <w:t xml:space="preserve">(Wickham, Chang, et al., 2026)</w:t>
+      </w:r>
+      <w:r>
+        <w:t xml:space="preserve"> </w:t>
+      </w:r>
+      <w:r>
+        <w:t xml:space="preserve">and combined using</w:t>
       </w:r>
       <w:r>
         <w:t xml:space="preserve"> </w:t>
@@ -3515,19 +3502,16 @@
         <w:rPr>
           <w:rStyle w:val="VerbatimChar"/>
         </w:rPr>
-        <w:t xml:space="preserve">ggplot2</w:t>
-      </w:r>
-      <w:r>
-        <w:t xml:space="preserve"> </w:t>
-      </w:r>
-      <w:r>
-        <w:t xml:space="preserve">(Wickham, Chang, et al., 2026)</w:t>
-      </w:r>
-      <w:r>
-        <w:t xml:space="preserve"> </w:t>
-      </w:r>
-      <w:r>
-        <w:t xml:space="preserve">and combined using</w:t>
+        <w:t xml:space="preserve">patchwork</w:t>
+      </w:r>
+      <w:r>
+        <w:t xml:space="preserve"> </w:t>
+      </w:r>
+      <w:r>
+        <w:t xml:space="preserve">(Pedersen, 2025)</w:t>
+      </w:r>
+      <w:r>
+        <w:t xml:space="preserve">,</w:t>
       </w:r>
       <w:r>
         <w:t xml:space="preserve"> </w:t>
@@ -3536,13 +3520,49 @@
         <w:rPr>
           <w:rStyle w:val="VerbatimChar"/>
         </w:rPr>
-        <w:t xml:space="preserve">patchwork</w:t>
-      </w:r>
-      <w:r>
-        <w:t xml:space="preserve"> </w:t>
-      </w:r>
-      <w:r>
-        <w:t xml:space="preserve">(Pedersen, 2025)</w:t>
+        <w:t xml:space="preserve">cowplot</w:t>
+      </w:r>
+      <w:r>
+        <w:t xml:space="preserve"> </w:t>
+      </w:r>
+      <w:r>
+        <w:t xml:space="preserve">(Wilke, 2025)</w:t>
+      </w:r>
+      <w:r>
+        <w:t xml:space="preserve">, with axis scales formatted via</w:t>
+      </w:r>
+      <w:r>
+        <w:t xml:space="preserve"> </w:t>
+      </w:r>
+      <w:r>
+        <w:rPr>
+          <w:rStyle w:val="VerbatimChar"/>
+        </w:rPr>
+        <w:t xml:space="preserve">scales</w:t>
+      </w:r>
+      <w:r>
+        <w:t xml:space="preserve"> </w:t>
+      </w:r>
+      <w:r>
+        <w:t xml:space="preserve">(Wickham, Pedersen, et al., 2025)</w:t>
+      </w:r>
+      <w:r>
+        <w:t xml:space="preserve">. Tables and spreadsheets were prepared with</w:t>
+      </w:r>
+      <w:r>
+        <w:t xml:space="preserve"> </w:t>
+      </w:r>
+      <w:r>
+        <w:rPr>
+          <w:rStyle w:val="VerbatimChar"/>
+        </w:rPr>
+        <w:t xml:space="preserve">flextable</w:t>
+      </w:r>
+      <w:r>
+        <w:t xml:space="preserve"> </w:t>
+      </w:r>
+      <w:r>
+        <w:t xml:space="preserve">(Gohel &amp; Skintzos, 2025)</w:t>
       </w:r>
       <w:r>
         <w:t xml:space="preserve">,</w:t>
@@ -3554,13 +3574,13 @@
         <w:rPr>
           <w:rStyle w:val="VerbatimChar"/>
         </w:rPr>
-        <w:t xml:space="preserve">cowplot</w:t>
-      </w:r>
-      <w:r>
-        <w:t xml:space="preserve"> </w:t>
-      </w:r>
-      <w:r>
-        <w:t xml:space="preserve">(Wilke, 2025)</w:t>
+        <w:t xml:space="preserve">kableExtra</w:t>
+      </w:r>
+      <w:r>
+        <w:t xml:space="preserve"> </w:t>
+      </w:r>
+      <w:r>
+        <w:t xml:space="preserve">(Zhu, 2024)</w:t>
       </w:r>
       <w:r>
         <w:t xml:space="preserve">, and</w:t>
@@ -3572,26 +3592,22 @@
         <w:rPr>
           <w:rStyle w:val="VerbatimChar"/>
         </w:rPr>
-        <w:t xml:space="preserve">ggpubr</w:t>
-      </w:r>
-      <w:r>
-        <w:t xml:space="preserve"> </w:t>
-      </w:r>
-      <w:r>
-        <w:t xml:space="preserve">(</w:t>
-      </w:r>
-      <w:r>
-        <w:rPr>
-          <w:b/>
-          <w:bCs/>
-        </w:rPr>
-        <w:t xml:space="preserve">R-ggpubr?</w:t>
-      </w:r>
-      <w:r>
-        <w:t xml:space="preserve">)</w:t>
-      </w:r>
-      <w:r>
-        <w:t xml:space="preserve">, with axis scales formatted via</w:t>
+        <w:t xml:space="preserve">openxlsx</w:t>
+      </w:r>
+      <w:r>
+        <w:t xml:space="preserve"> </w:t>
+      </w:r>
+      <w:r>
+        <w:t xml:space="preserve">(Schauberger &amp; Walker, 2025)</w:t>
+      </w:r>
+      <w:r>
+        <w:t xml:space="preserve">. Additional modeling described in the OpenAlex mean</w:t>
+      </w:r>
+      <w:r>
+        <w:t xml:space="preserve"> </w:t>
+      </w:r>
+      <w:r>
+        <w:t xml:space="preserve">citedness section used</w:t>
       </w:r>
       <w:r>
         <w:t xml:space="preserve"> </w:t>
@@ -3600,22 +3616,16 @@
         <w:rPr>
           <w:rStyle w:val="VerbatimChar"/>
         </w:rPr>
-        <w:t xml:space="preserve">scales</w:t>
-      </w:r>
-      <w:r>
-        <w:t xml:space="preserve"> </w:t>
-      </w:r>
-      <w:r>
-        <w:t xml:space="preserve">(Wickham, Pedersen, et al., 2025)</w:t>
-      </w:r>
-      <w:r>
-        <w:t xml:space="preserve">. Tables</w:t>
-      </w:r>
-      <w:r>
-        <w:t xml:space="preserve"> </w:t>
-      </w:r>
-      <w:r>
-        <w:t xml:space="preserve">and spreadsheets were prepared with</w:t>
+        <w:t xml:space="preserve">mgcv</w:t>
+      </w:r>
+      <w:r>
+        <w:t xml:space="preserve"> </w:t>
+      </w:r>
+      <w:r>
+        <w:t xml:space="preserve">(Wood, 2025)</w:t>
+      </w:r>
+      <w:r>
+        <w:t xml:space="preserve">,</w:t>
       </w:r>
       <w:r>
         <w:t xml:space="preserve"> </w:t>
@@ -3624,13 +3634,13 @@
         <w:rPr>
           <w:rStyle w:val="VerbatimChar"/>
         </w:rPr>
-        <w:t xml:space="preserve">flextable</w:t>
-      </w:r>
-      <w:r>
-        <w:t xml:space="preserve"> </w:t>
-      </w:r>
-      <w:r>
-        <w:t xml:space="preserve">(Gohel &amp; Skintzos, 2025)</w:t>
+        <w:t xml:space="preserve">lme4</w:t>
+      </w:r>
+      <w:r>
+        <w:t xml:space="preserve"> </w:t>
+      </w:r>
+      <w:r>
+        <w:t xml:space="preserve">(Bates et al., 2026)</w:t>
       </w:r>
       <w:r>
         <w:t xml:space="preserve">,</w:t>
@@ -3642,13 +3652,49 @@
         <w:rPr>
           <w:rStyle w:val="VerbatimChar"/>
         </w:rPr>
-        <w:t xml:space="preserve">kableExtra</w:t>
-      </w:r>
-      <w:r>
-        <w:t xml:space="preserve"> </w:t>
-      </w:r>
-      <w:r>
-        <w:t xml:space="preserve">(Zhu, 2024)</w:t>
+        <w:t xml:space="preserve">rms</w:t>
+      </w:r>
+      <w:r>
+        <w:t xml:space="preserve"> </w:t>
+      </w:r>
+      <w:r>
+        <w:t xml:space="preserve">(Harrell Jr, 2026)</w:t>
+      </w:r>
+      <w:r>
+        <w:t xml:space="preserve">,</w:t>
+      </w:r>
+      <w:r>
+        <w:t xml:space="preserve"> </w:t>
+      </w:r>
+      <w:r>
+        <w:rPr>
+          <w:rStyle w:val="VerbatimChar"/>
+        </w:rPr>
+        <w:t xml:space="preserve">pROC</w:t>
+      </w:r>
+      <w:r>
+        <w:t xml:space="preserve"> </w:t>
+      </w:r>
+      <w:r>
+        <w:t xml:space="preserve">(Robin et al., 2025)</w:t>
+      </w:r>
+      <w:r>
+        <w:t xml:space="preserve">,</w:t>
+      </w:r>
+      <w:r>
+        <w:t xml:space="preserve"> </w:t>
+      </w:r>
+      <w:r>
+        <w:rPr>
+          <w:rStyle w:val="VerbatimChar"/>
+        </w:rPr>
+        <w:t xml:space="preserve">DHARMa</w:t>
+      </w:r>
+      <w:r>
+        <w:t xml:space="preserve"> </w:t>
+      </w:r>
+      <w:r>
+        <w:t xml:space="preserve">(Hartig, 2024)</w:t>
       </w:r>
       <w:r>
         <w:t xml:space="preserve">, and</w:t>
@@ -3660,120 +3706,6 @@
         <w:rPr>
           <w:rStyle w:val="VerbatimChar"/>
         </w:rPr>
-        <w:t xml:space="preserve">openxlsx</w:t>
-      </w:r>
-      <w:r>
-        <w:t xml:space="preserve"> </w:t>
-      </w:r>
-      <w:r>
-        <w:t xml:space="preserve">(Schauberger &amp; Walker, 2025)</w:t>
-      </w:r>
-      <w:r>
-        <w:t xml:space="preserve">. Additional</w:t>
-      </w:r>
-      <w:r>
-        <w:t xml:space="preserve"> </w:t>
-      </w:r>
-      <w:r>
-        <w:t xml:space="preserve">modeling described in the OpenAlex mean citedness section used</w:t>
-      </w:r>
-      <w:r>
-        <w:t xml:space="preserve"> </w:t>
-      </w:r>
-      <w:r>
-        <w:rPr>
-          <w:rStyle w:val="VerbatimChar"/>
-        </w:rPr>
-        <w:t xml:space="preserve">mgcv</w:t>
-      </w:r>
-      <w:r>
-        <w:t xml:space="preserve"> </w:t>
-      </w:r>
-      <w:r>
-        <w:t xml:space="preserve">(Wood, 2025)</w:t>
-      </w:r>
-      <w:r>
-        <w:t xml:space="preserve">,</w:t>
-      </w:r>
-      <w:r>
-        <w:t xml:space="preserve"> </w:t>
-      </w:r>
-      <w:r>
-        <w:rPr>
-          <w:rStyle w:val="VerbatimChar"/>
-        </w:rPr>
-        <w:t xml:space="preserve">lme4</w:t>
-      </w:r>
-      <w:r>
-        <w:t xml:space="preserve"> </w:t>
-      </w:r>
-      <w:r>
-        <w:t xml:space="preserve">(Bates et al., 2026)</w:t>
-      </w:r>
-      <w:r>
-        <w:t xml:space="preserve">,</w:t>
-      </w:r>
-      <w:r>
-        <w:t xml:space="preserve"> </w:t>
-      </w:r>
-      <w:r>
-        <w:rPr>
-          <w:rStyle w:val="VerbatimChar"/>
-        </w:rPr>
-        <w:t xml:space="preserve">rms</w:t>
-      </w:r>
-      <w:r>
-        <w:t xml:space="preserve"> </w:t>
-      </w:r>
-      <w:r>
-        <w:t xml:space="preserve">(Harrell Jr, 2026)</w:t>
-      </w:r>
-      <w:r>
-        <w:t xml:space="preserve">,</w:t>
-      </w:r>
-      <w:r>
-        <w:t xml:space="preserve"> </w:t>
-      </w:r>
-      <w:r>
-        <w:rPr>
-          <w:rStyle w:val="VerbatimChar"/>
-        </w:rPr>
-        <w:t xml:space="preserve">pROC</w:t>
-      </w:r>
-      <w:r>
-        <w:t xml:space="preserve"> </w:t>
-      </w:r>
-      <w:r>
-        <w:t xml:space="preserve">(Robin et al., 2025)</w:t>
-      </w:r>
-      <w:r>
-        <w:t xml:space="preserve">,</w:t>
-      </w:r>
-      <w:r>
-        <w:t xml:space="preserve"> </w:t>
-      </w:r>
-      <w:r>
-        <w:rPr>
-          <w:rStyle w:val="VerbatimChar"/>
-        </w:rPr>
-        <w:t xml:space="preserve">DHARMa</w:t>
-      </w:r>
-      <w:r>
-        <w:t xml:space="preserve"> </w:t>
-      </w:r>
-      <w:r>
-        <w:t xml:space="preserve">(Hartig, 2024)</w:t>
-      </w:r>
-      <w:r>
-        <w:t xml:space="preserve">, and</w:t>
-      </w:r>
-      <w:r>
-        <w:t xml:space="preserve"> </w:t>
-      </w:r>
-      <w:r>
-        <w:rPr>
-          <w:rStyle w:val="VerbatimChar"/>
-        </w:rPr>
         <w:t xml:space="preserve">detectseparation</w:t>
       </w:r>
       <w:r>
@@ -3783,13 +3715,13 @@
         <w:t xml:space="preserve">(Kosmidis et al., 2026)</w:t>
       </w:r>
       <w:r>
-        <w:t xml:space="preserve">. To ensure</w:t>
-      </w:r>
-      <w:r>
-        <w:t xml:space="preserve"> </w:t>
-      </w:r>
-      <w:r>
-        <w:t xml:space="preserve">computational reproducibility, project dependencies were managed with</w:t>
+        <w:t xml:space="preserve">. To ensure computational reproducibility, project</w:t>
+      </w:r>
+      <w:r>
+        <w:t xml:space="preserve"> </w:t>
+      </w:r>
+      <w:r>
+        <w:t xml:space="preserve">dependencies were managed with</w:t>
       </w:r>
       <w:r>
         <w:t xml:space="preserve"> </w:t>
@@ -3955,7 +3887,7 @@
         <w:t xml:space="preserve"> </w:t>
       </w:r>
       <w:r>
-        <w:t xml:space="preserve">OpenAlex APIs. The final sample consisted of 1,234 pairs of original and</w:t>
+        <w:t xml:space="preserve">OpenAlex APIs. The final sample consisted of 1,235 pairs of original and</w:t>
       </w:r>
       <w:r>
         <w:t xml:space="preserve"> </w:t>
@@ -5578,13 +5510,13 @@
         <w:t xml:space="preserve"> </w:t>
       </w:r>
       <w:r>
-        <w:t xml:space="preserve">presents the multilevel</w:t>
-      </w:r>
-      <w:r>
-        <w:t xml:space="preserve"> </w:t>
-      </w:r>
-      <w:r>
-        <w:t xml:space="preserve">diagram.</w:t>
+        <w:t xml:space="preserve">presents the nesting</w:t>
+      </w:r>
+      <w:r>
+        <w:t xml:space="preserve"> </w:t>
+      </w:r>
+      <w:r>
+        <w:t xml:space="preserve">structure.</w:t>
       </w:r>
     </w:p>
     <w:p>
@@ -5592,7 +5524,7 @@
         <w:pStyle w:val="Textkrper"/>
       </w:pPr>
       <w:r>
-        <w:t xml:space="preserve">(#tab:multilevel-diagram) Flowchart of nesting structure</w:t>
+        <w:t xml:space="preserve">(#tab:multilevel-diagram) Table of the nesting structure.</w:t>
       </w:r>
     </w:p>
     <w:p>
@@ -7494,7 +7426,7 @@
         <w:pStyle w:val="FirstParagraph"/>
       </w:pPr>
       <w:r>
-        <w:t xml:space="preserve">This model tested whether the experimental manipulation and research</w:t>
+        <w:t xml:space="preserve">This model tested whether experimental manipulation and research</w:t>
       </w:r>
       <w:r>
         <w:t xml:space="preserve"> </w:t>
@@ -8058,7 +7990,7 @@
         <w:t xml:space="preserve"> </w:t>
       </w:r>
       <w:r>
-        <w:t xml:space="preserve">between theoretical fidelity and empirical estimability. We</w:t>
+        <w:t xml:space="preserve">between theoretical fidelity and empirical estimation quality. We</w:t>
       </w:r>
       <w:r>
         <w:t xml:space="preserve"> </w:t>
@@ -9215,13 +9147,36 @@
         <w:pStyle w:val="FirstParagraph"/>
       </w:pPr>
       <w:r>
-        <w:t xml:space="preserve">The following table includes different possible outcomes and our</w:t>
-      </w:r>
-      <w:r>
-        <w:t xml:space="preserve"> </w:t>
-      </w:r>
-      <w:r>
-        <w:t xml:space="preserve">respective interpretation.</w:t>
+        <w:t xml:space="preserve">Different possible outcomes and our respective interpretation are</w:t>
+      </w:r>
+      <w:r>
+        <w:t xml:space="preserve"> </w:t>
+      </w:r>
+      <w:r>
+        <w:t xml:space="preserve">presented in</w:t>
+      </w:r>
+      <w:r>
+        <w:t xml:space="preserve"> </w:t>
+      </w:r>
+      <w:r>
+        <w:t xml:space="preserve">3</w:t>
+      </w:r>
+      <w:r>
+        <w:t xml:space="preserve">. Given the current data, OMC</w:t>
+      </w:r>
+      <w:r>
+        <w:t xml:space="preserve"> </w:t>
+      </w:r>
+      <w:r>
+        <w:t xml:space="preserve">positively and negatively predicting replicability is not the case.</w:t>
+      </w:r>
+    </w:p>
+    <w:p>
+      <w:pPr>
+        <w:pStyle w:val="Textkrper"/>
+      </w:pPr>
+      <w:r>
+        <w:t xml:space="preserve">(#tab:possible-outcomes) Possible outcomes and their interpretations.</w:t>
       </w:r>
     </w:p>
     <w:tbl>
@@ -9542,13 +9497,13 @@
         <w:t xml:space="preserve"> </w:t>
       </w:r>
       <w:r>
-        <w:t xml:space="preserve">for two months after the game’s public launch, that is, from May 20</w:t>
-      </w:r>
-      <w:r>
-        <w:t xml:space="preserve"> </w:t>
-      </w:r>
-      <w:r>
-        <w:t xml:space="preserve">until July 20.</w:t>
+        <w:t xml:space="preserve">for at least two months after the game’s public launch, that is, from</w:t>
+      </w:r>
+      <w:r>
+        <w:t xml:space="preserve"> </w:t>
+      </w:r>
+      <w:r>
+        <w:t xml:space="preserve">May 20 until July 20.</w:t>
       </w:r>
     </w:p>
     <w:p>
@@ -9670,7 +9625,7 @@
         </m:r>
       </m:oMath>
       <w:r>
-        <w:t xml:space="preserve">, wherWe</w:t>
+        <w:t xml:space="preserve">, wher</w:t>
       </w:r>
       <w:r>
         <w:t xml:space="preserve"> </w:t>
@@ -9700,13 +9655,13 @@
         <w:t xml:space="preserve"> </w:t>
       </w:r>
       <w:r>
-        <w:t xml:space="preserve">was the average number of trials per participant) to</w:t>
-      </w:r>
-      <w:r>
-        <w:t xml:space="preserve"> </w:t>
-      </w:r>
-      <w:r>
-        <w:t xml:space="preserve">contextualize the effective sample size.</w:t>
+        <w:t xml:space="preserve">was the average number of trials per participant) to contextualize the</w:t>
+      </w:r>
+      <w:r>
+        <w:t xml:space="preserve"> </w:t>
+      </w:r>
+      <w:r>
+        <w:t xml:space="preserve">effective sample size.</w:t>
       </w:r>
     </w:p>
     <w:bookmarkEnd w:id="71"/>
@@ -9799,7 +9754,7 @@
         <w:t xml:space="preserve"> </w:t>
       </w:r>
       <w:r>
-        <w:t xml:space="preserve">version of the journals’ impact factor (JIF) and collected data to</w:t>
+        <w:t xml:space="preserve">version of the OMC and collected data to</w:t>
       </w:r>
       <w:r>
         <w:t xml:space="preserve"> </w:t>
@@ -9811,7 +9766,7 @@
         <w:t xml:space="preserve"> </w:t>
       </w:r>
       <w:r>
-        <w:t xml:space="preserve">JIF and replicability were [unrelated / positively correlated /</w:t>
+        <w:t xml:space="preserve">OMC and replicability were [unrelated / positively correlated /</w:t>
       </w:r>
       <w:r>
         <w:t xml:space="preserve"> </w:t>
@@ -9829,7 +9784,7 @@
         <w:t xml:space="preserve"> </w:t>
       </w:r>
       <w:r>
-        <w:t xml:space="preserve">high JIF. How JIF affected replicability ratings [differed / did not</w:t>
+        <w:t xml:space="preserve">high OMC. How OMC affected replicability ratings [differed / did not</w:t>
       </w:r>
       <w:r>
         <w:t xml:space="preserve"> </w:t>

</xml_diff>